<commit_message>
docs(acpos): close 34 authority-backed binding gaps
</commit_message>
<xml_diff>
--- a/ACPOS_SG-02_QA審查項目名單_Mother_Basic_Design_OPTIMIZED.docx
+++ b/ACPOS_SG-02_QA審查項目名單_Mother_Basic_Design_OPTIMIZED.docx
@@ -18763,10 +18763,7 @@
           </w:tcPr>
           <w:p>
             <w:r>
-              <w:rPr>
-                <w:sz w:val="10"/>
-              </w:rPr>
-              <w:t>—</w:t>
+              <w:t>Projection / source page read owner</w:t>
             </w:r>
           </w:p>
         </w:tc>
@@ -18934,10 +18931,7 @@
           </w:tcPr>
           <w:p>
             <w:r>
-              <w:rPr>
-                <w:sz w:val="10"/>
-              </w:rPr>
-              <w:t>—</w:t>
+              <w:t>Projection / source page read owner</w:t>
             </w:r>
           </w:p>
         </w:tc>
@@ -19105,10 +19099,7 @@
           </w:tcPr>
           <w:p>
             <w:r>
-              <w:rPr>
-                <w:sz w:val="10"/>
-              </w:rPr>
-              <w:t>—</w:t>
+              <w:t>Projection / source page read owner</w:t>
             </w:r>
           </w:p>
         </w:tc>
@@ -19276,10 +19267,7 @@
           </w:tcPr>
           <w:p>
             <w:r>
-              <w:rPr>
-                <w:sz w:val="10"/>
-              </w:rPr>
-              <w:t>—</w:t>
+              <w:t>Projection / source page read owner</w:t>
             </w:r>
           </w:p>
         </w:tc>
@@ -19447,10 +19435,7 @@
           </w:tcPr>
           <w:p>
             <w:r>
-              <w:rPr>
-                <w:sz w:val="10"/>
-              </w:rPr>
-              <w:t>—</w:t>
+              <w:t>Projection / source page read owner</w:t>
             </w:r>
           </w:p>
         </w:tc>
@@ -19618,10 +19603,7 @@
           </w:tcPr>
           <w:p>
             <w:r>
-              <w:rPr>
-                <w:sz w:val="10"/>
-              </w:rPr>
-              <w:t>—</w:t>
+              <w:t>Projection / source page read owner</w:t>
             </w:r>
           </w:p>
         </w:tc>
@@ -19789,10 +19771,7 @@
           </w:tcPr>
           <w:p>
             <w:r>
-              <w:rPr>
-                <w:sz w:val="10"/>
-              </w:rPr>
-              <w:t>—</w:t>
+              <w:t>Projection / source page read owner</w:t>
             </w:r>
           </w:p>
         </w:tc>
@@ -19960,10 +19939,7 @@
           </w:tcPr>
           <w:p>
             <w:r>
-              <w:rPr>
-                <w:sz w:val="10"/>
-              </w:rPr>
-              <w:t>—</w:t>
+              <w:t>Projection / source page read owner</w:t>
             </w:r>
           </w:p>
         </w:tc>
@@ -20473,10 +20449,7 @@
           </w:tcPr>
           <w:p>
             <w:r>
-              <w:rPr>
-                <w:sz w:val="10"/>
-              </w:rPr>
-              <w:t>—</w:t>
+              <w:t>Projection / source page read owner</w:t>
             </w:r>
           </w:p>
         </w:tc>

</xml_diff>